<commit_message>
docs: registra a entrega no PR #21
O PR #20 já estava mesclado; o histórico de PRs, o checklist, os
relatórios e o registro 21 passam a apontar para o PR #21.

Co-Authored-By: Claude Opus 5.5 <noreply@anthropic.com>
</commit_message>
<xml_diff>
--- a/DocumentacaoFinal/INTEGRA_2026_Entrega_7_21_Teste_do_Banco_Oxide_e_Teste_em_Massa.docx
+++ b/DocumentacaoFinal/INTEGRA_2026_Entrega_7_21_Teste_do_Banco_Oxide_e_Teste_em_Massa.docx
@@ -1017,7 +1017,7 @@
                 <w:szCs w:val="17"/>
                 <w:lang w:val="pt-BR"/>
               </w:rPr>
-              <w:t xml:space="preserve">Justificativa: as correções e o modo WAL foram adotados depois da aprovação de Natã e enviados ao GitHub (PR #20).</w:t>
+              <w:t xml:space="preserve">Justificativa: as correções e o modo WAL foram adotados depois da aprovação de Natã e enviados ao GitHub (PR #21).</w:t>
             </w:r>
           </w:p>
         </w:tc>
@@ -1094,7 +1094,7 @@
                 <w:szCs w:val="17"/>
                 <w:lang w:val="pt-BR"/>
               </w:rPr>
-              <w:t xml:space="preserve">Relatorio-de-Teste-2026-10-10-13h45.md e Relatorio-de-Teste-2026-10-10-14h00.md; Oxidedb.md 2.1; descrição do sistema principal (README do repositório fluxid_integra2026); documentação do SQLite sobre o modo WAL; PR #20.</w:t>
+              <w:t xml:space="preserve">Relatorio-de-Teste-2026-10-10-13h45.md e Relatorio-de-Teste-2026-10-10-14h00.md; Oxidedb.md 2.1; descrição do sistema principal (README do repositório fluxid_integra2026); documentação do SQLite sobre o modo WAL; PR #21.</w:t>
             </w:r>
           </w:p>
         </w:tc>

</xml_diff>